<commit_message>
Remove the size-4 flag cap: the search is now exhaustive
The full primitive size-4 space is 849,381 subsets, small enough to
enumerate outright, so the cap was removed rather than raised. Sizes 2, 3
and 4 are now all exhaustive: 867,694 candidates yielding 5,384 distinct
coverage patterns, up from 1,706 under the cap.

The conclusion does not move. No single flag covers every constraint, no
pair covers every constraint, and greedy still needs 9 flag bits. The
rarest constraint is now covered by 15 flags rather than 4, and the exact
pair search over those still returns nothing.

This retires one of the paper's stated limitations: the Section 5 negative
result is not an artifact of sampling. The manuscript is regenerated and its
limitation paragraph updated accordingly, and a test pins the size of the
space so a change in the prefilter cannot silently shrink it.
</commit_message>
<xml_diff>
--- a/paper/code_switching_paper_v2.docx
+++ b/paper/code_switching_paper_v2.docx
@@ -689,7 +689,7 @@
         <w:rPr>
           <w:i w:val="0"/>
         </w:rPr>
-        <w:t>For two-bit designs we recast the question as exact set cover. Each constraint is a pair of faults in one syndrome class with inequivalent residuals that must receive different labels; each candidate flag covers the constraints on which its bit differs; a certifying pair is two flags whose coverage unions to everything. Over 2,405 constraints and 1,706 distinct coverage patterns, branching on the rarest constraint makes the search exact rather than quadratic, and it returns no covering pair. A greedy cover requires 9 flag bits.</w:t>
+        <w:t>For two-bit designs we recast the question as exact set cover. Each constraint is a pair of faults in one syndrome class with inequivalent residuals that must receive different labels; each candidate flag covers the constraints on which its bit differs; a certifying pair is two flags whose coverage unions to everything. Over 2,405 constraints and 5,384 distinct coverage patterns, branching on the rarest constraint makes the search exact rather than quadratic, and it returns no covering pair. A greedy cover requires 9 flag bits.</w:t>
       </w:r>
     </w:p>
     <w:p>
@@ -1513,7 +1513,7 @@
         <w:rPr>
           <w:i w:val="0"/>
         </w:rPr>
-        <w:t>Limitations. Our searches are bounded and we state the bounds: size-four flags were capped, the two-flag stage ran on the default cascade, and the greedy cover of nine is an upper bound rather than the true minimum, so no lower bound above two bits is proved. The end-to-end certificate covers single faults; we make no claim about pairs. The hand-off round is taken noiseless by convention. Optimization of the circuits is left for future work, and re-verification after every optimization pass is mandatory under our methodology.</w:t>
+        <w:t>Limitations. Where a search is bounded we state the bound. The single-flag family is exhaustive at two, three and four couplings, 867,694 candidates in total, so the negative result of Section 5 is not an artifact of sampling. The two-flag stage ran on the default cascade rather than all twenty-four, and the greedy cover of nine is an upper bound rather than the true minimum, so no lower bound above two bits is proved. The end-to-end certificate covers single faults; we make no claim about pairs. The hand-off round is taken noiseless by convention. Optimization of the circuits is left for future work, and re-verification after every optimization pass is mandatory under our methodology.</w:t>
       </w:r>
     </w:p>
     <w:p>

</xml_diff>